<commit_message>
Adding plot and report
</commit_message>
<xml_diff>
--- a/results/README.docx
+++ b/results/README.docx
@@ -73,12 +73,24 @@
       <w:r>
         <w:t xml:space="preserve">Token A verification link: </w:t>
       </w:r>
-      <w:hyperlink r:id="rId4" w:history="1">
-        <w:r>
-          <w:rPr>
-            <w:rStyle w:val="Hyperlink"/>
-          </w:rPr>
-          <w:t>https://sepolia.etherscan.io/address/0xd1f147a34d9C8ccdb123aC2DD56B021ac8454B70#code</w:t>
+      <w:hyperlink r:id="rId5" w:anchor="code" w:history="1">
+        <w:r>
+          <w:rPr>
+            <w:rStyle w:val="Hyperlink"/>
+          </w:rPr>
+          <w:t>https://sepolia.ethersca</w:t>
+        </w:r>
+        <w:r>
+          <w:rPr>
+            <w:rStyle w:val="Hyperlink"/>
+          </w:rPr>
+          <w:t>n</w:t>
+        </w:r>
+        <w:r>
+          <w:rPr>
+            <w:rStyle w:val="Hyperlink"/>
+          </w:rPr>
+          <w:t>.io/address/0xd1f147a34d9C8ccdb123aC2DD56B021ac8454B70#code</w:t>
         </w:r>
       </w:hyperlink>
     </w:p>
@@ -86,12 +98,24 @@
       <w:r>
         <w:t xml:space="preserve">Token B: </w:t>
       </w:r>
-      <w:hyperlink r:id="rId5" w:history="1">
-        <w:r>
-          <w:rPr>
-            <w:rStyle w:val="Hyperlink"/>
-          </w:rPr>
-          <w:t>https://sepolia.etherscan.io/address/0x0Dd71284821f77d1d56D8Bf7e46B332e55A25B2E#code</w:t>
+      <w:hyperlink r:id="rId6" w:anchor="code" w:history="1">
+        <w:r>
+          <w:rPr>
+            <w:rStyle w:val="Hyperlink"/>
+          </w:rPr>
+          <w:t>https://sepolia.etherscan.io/address/0x0Dd71284</w:t>
+        </w:r>
+        <w:r>
+          <w:rPr>
+            <w:rStyle w:val="Hyperlink"/>
+          </w:rPr>
+          <w:t>8</w:t>
+        </w:r>
+        <w:r>
+          <w:rPr>
+            <w:rStyle w:val="Hyperlink"/>
+          </w:rPr>
+          <w:t>21f77d1d56D8Bf7e46B332e55A25B2E#code</w:t>
         </w:r>
       </w:hyperlink>
     </w:p>
@@ -100,7 +124,7 @@
       <w:r>
         <w:t xml:space="preserve">DEX 1: </w:t>
       </w:r>
-      <w:hyperlink r:id="rId6" w:history="1">
+      <w:hyperlink r:id="rId7" w:anchor="code" w:history="1">
         <w:r>
           <w:rPr>
             <w:rStyle w:val="Hyperlink"/>
@@ -114,12 +138,36 @@
       <w:r>
         <w:t xml:space="preserve">DEX 2: </w:t>
       </w:r>
-      <w:hyperlink r:id="rId7" w:history="1">
-        <w:r>
-          <w:rPr>
-            <w:rStyle w:val="Hyperlink"/>
-          </w:rPr>
-          <w:t>https://sepolia.etherscan.io/address/0x190a17c71174D6684d61Aa3c8cc63855a6Cdec2B#code</w:t>
+      <w:hyperlink r:id="rId8" w:anchor="code" w:history="1">
+        <w:r>
+          <w:rPr>
+            <w:rStyle w:val="Hyperlink"/>
+          </w:rPr>
+          <w:t>https://sepolia.etherscan</w:t>
+        </w:r>
+        <w:r>
+          <w:rPr>
+            <w:rStyle w:val="Hyperlink"/>
+          </w:rPr>
+          <w:t>.</w:t>
+        </w:r>
+        <w:r>
+          <w:rPr>
+            <w:rStyle w:val="Hyperlink"/>
+          </w:rPr>
+          <w:t>io/add</w:t>
+        </w:r>
+        <w:r>
+          <w:rPr>
+            <w:rStyle w:val="Hyperlink"/>
+          </w:rPr>
+          <w:t>r</w:t>
+        </w:r>
+        <w:r>
+          <w:rPr>
+            <w:rStyle w:val="Hyperlink"/>
+          </w:rPr>
+          <w:t>ess/0x190a17c71174D6684d61Aa3c8cc63855a6Cdec2B#code</w:t>
         </w:r>
       </w:hyperlink>
     </w:p>
@@ -136,7 +184,7 @@
       <w:r>
         <w:t xml:space="preserve">: </w:t>
       </w:r>
-      <w:hyperlink r:id="rId8" w:history="1">
+      <w:hyperlink r:id="rId9" w:anchor="code" w:history="1">
         <w:r>
           <w:rPr>
             <w:rStyle w:val="Hyperlink"/>
@@ -158,7 +206,7 @@
       <w:r>
         <w:t xml:space="preserve">: </w:t>
       </w:r>
-      <w:hyperlink r:id="rId9" w:history="1">
+      <w:hyperlink r:id="rId10" w:anchor="code" w:history="1">
         <w:r>
           <w:rPr>
             <w:rStyle w:val="Hyperlink"/>
@@ -171,12 +219,257 @@
       <w:r>
         <w:t xml:space="preserve">Arbitrage Token: </w:t>
       </w:r>
-      <w:hyperlink r:id="rId10" w:history="1">
-        <w:r>
-          <w:rPr>
-            <w:rStyle w:val="Hyperlink"/>
-          </w:rPr>
-          <w:t>https://sepolia.etherscan.io/address/0x4B5fE7720D072C26f89f68C84C539E5f778f41BB#code</w:t>
+      <w:hyperlink r:id="rId11" w:anchor="code" w:history="1">
+        <w:r>
+          <w:rPr>
+            <w:rStyle w:val="Hyperlink"/>
+          </w:rPr>
+          <w:t>https://sepolia.etherscan.io/address/0x4B5fE7720D072C2</w:t>
+        </w:r>
+        <w:r>
+          <w:rPr>
+            <w:rStyle w:val="Hyperlink"/>
+          </w:rPr>
+          <w:t>6</w:t>
+        </w:r>
+        <w:r>
+          <w:rPr>
+            <w:rStyle w:val="Hyperlink"/>
+          </w:rPr>
+          <w:t>f89f68C84C539E5f778f41BB#code</w:t>
+        </w:r>
+      </w:hyperlink>
+    </w:p>
+    <w:p/>
+    <w:p>
+      <w:proofErr w:type="spellStart"/>
+      <w:r>
+        <w:t>Vercel</w:t>
+      </w:r>
+      <w:proofErr w:type="spellEnd"/>
+      <w:r>
+        <w:t xml:space="preserve">: </w:t>
+      </w:r>
+      <w:hyperlink r:id="rId12" w:history="1">
+        <w:r>
+          <w:rPr>
+            <w:rStyle w:val="Hyperlink"/>
+          </w:rPr>
+          <w:t>https://de-fi-blockchain.vercel.app/</w:t>
+        </w:r>
+      </w:hyperlink>
+    </w:p>
+    <w:p/>
+    <w:p>
+      <w:pPr>
+        <w:numPr>
+          <w:ilvl w:val="0"/>
+          <w:numId w:val="1"/>
+        </w:numPr>
+      </w:pPr>
+      <w:r>
+        <w:rPr>
+          <w:b/>
+          <w:bCs/>
+        </w:rPr>
+        <w:lastRenderedPageBreak/>
+        <w:t>Add Liquidity:</w:t>
+      </w:r>
+      <w:r>
+        <w:t> </w:t>
+      </w:r>
+      <w:hyperlink r:id="rId13" w:tgtFrame="_blank" w:history="1">
+        <w:r>
+          <w:rPr>
+            <w:rStyle w:val="Hyperlink"/>
+          </w:rPr>
+          <w:t>0x1f9496a43dabd...</w:t>
+        </w:r>
+      </w:hyperlink>
+    </w:p>
+    <w:p>
+      <w:pPr>
+        <w:numPr>
+          <w:ilvl w:val="0"/>
+          <w:numId w:val="1"/>
+        </w:numPr>
+      </w:pPr>
+      <w:r>
+        <w:rPr>
+          <w:b/>
+          <w:bCs/>
+        </w:rPr>
+        <w:t>Remove Liquidity:</w:t>
+      </w:r>
+      <w:r>
+        <w:t> </w:t>
+      </w:r>
+      <w:hyperlink r:id="rId14" w:tgtFrame="_blank" w:history="1">
+        <w:r>
+          <w:rPr>
+            <w:rStyle w:val="Hyperlink"/>
+          </w:rPr>
+          <w:t>0x25e4d18387638...</w:t>
+        </w:r>
+      </w:hyperlink>
+    </w:p>
+    <w:p>
+      <w:pPr>
+        <w:numPr>
+          <w:ilvl w:val="0"/>
+          <w:numId w:val="1"/>
+        </w:numPr>
+      </w:pPr>
+      <w:r>
+        <w:rPr>
+          <w:b/>
+          <w:bCs/>
+        </w:rPr>
+        <w:t xml:space="preserve">Swap </w:t>
+      </w:r>
+      <w:proofErr w:type="spellStart"/>
+      <w:r>
+        <w:rPr>
+          <w:b/>
+          <w:bCs/>
+        </w:rPr>
+        <w:t>TokenA</w:t>
+      </w:r>
+      <w:proofErr w:type="spellEnd"/>
+      <w:r>
+        <w:rPr>
+          <w:b/>
+          <w:bCs/>
+        </w:rPr>
+        <w:t xml:space="preserve"> → </w:t>
+      </w:r>
+      <w:proofErr w:type="spellStart"/>
+      <w:r>
+        <w:rPr>
+          <w:b/>
+          <w:bCs/>
+        </w:rPr>
+        <w:t>TokenB</w:t>
+      </w:r>
+      <w:proofErr w:type="spellEnd"/>
+      <w:r>
+        <w:rPr>
+          <w:b/>
+          <w:bCs/>
+        </w:rPr>
+        <w:t>:</w:t>
+      </w:r>
+      <w:r>
+        <w:t> </w:t>
+      </w:r>
+      <w:hyperlink r:id="rId15" w:tgtFrame="_blank" w:history="1">
+        <w:r>
+          <w:rPr>
+            <w:rStyle w:val="Hyperlink"/>
+          </w:rPr>
+          <w:t>0x863911f9b5909...</w:t>
+        </w:r>
+      </w:hyperlink>
+    </w:p>
+    <w:p>
+      <w:pPr>
+        <w:numPr>
+          <w:ilvl w:val="0"/>
+          <w:numId w:val="1"/>
+        </w:numPr>
+      </w:pPr>
+      <w:r>
+        <w:rPr>
+          <w:b/>
+          <w:bCs/>
+        </w:rPr>
+        <w:t xml:space="preserve">Swap </w:t>
+      </w:r>
+      <w:proofErr w:type="spellStart"/>
+      <w:r>
+        <w:rPr>
+          <w:b/>
+          <w:bCs/>
+        </w:rPr>
+        <w:t>TokenB</w:t>
+      </w:r>
+      <w:proofErr w:type="spellEnd"/>
+      <w:r>
+        <w:rPr>
+          <w:b/>
+          <w:bCs/>
+        </w:rPr>
+        <w:t xml:space="preserve"> → </w:t>
+      </w:r>
+      <w:proofErr w:type="spellStart"/>
+      <w:r>
+        <w:rPr>
+          <w:b/>
+          <w:bCs/>
+        </w:rPr>
+        <w:t>TokenA</w:t>
+      </w:r>
+      <w:proofErr w:type="spellEnd"/>
+      <w:r>
+        <w:rPr>
+          <w:b/>
+          <w:bCs/>
+        </w:rPr>
+        <w:t>:</w:t>
+      </w:r>
+      <w:r>
+        <w:t> </w:t>
+      </w:r>
+      <w:hyperlink r:id="rId16" w:tgtFrame="_blank" w:history="1">
+        <w:r>
+          <w:rPr>
+            <w:rStyle w:val="Hyperlink"/>
+          </w:rPr>
+          <w:t>0xce1b283d55e59...</w:t>
+        </w:r>
+      </w:hyperlink>
+    </w:p>
+    <w:p>
+      <w:pPr>
+        <w:numPr>
+          <w:ilvl w:val="0"/>
+          <w:numId w:val="1"/>
+        </w:numPr>
+      </w:pPr>
+      <w:r>
+        <w:rPr>
+          <w:b/>
+          <w:bCs/>
+        </w:rPr>
+        <w:t>Profitable Arbitrage:</w:t>
+      </w:r>
+      <w:r>
+        <w:t> Pending execution...</w:t>
+      </w:r>
+    </w:p>
+    <w:p>
+      <w:pPr>
+        <w:numPr>
+          <w:ilvl w:val="0"/>
+          <w:numId w:val="1"/>
+        </w:numPr>
+      </w:pPr>
+      <w:r>
+        <w:rPr>
+          <w:b/>
+          <w:bCs/>
+        </w:rPr>
+        <w:t>Failed Arbitrage:</w:t>
+      </w:r>
+      <w:r>
+        <w:t> </w:t>
+      </w:r>
+      <w:hyperlink r:id="rId17" w:tgtFrame="_blank" w:history="1">
+        <w:r>
+          <w:rPr>
+            <w:rStyle w:val="Hyperlink"/>
+          </w:rPr>
+          <w:t>0x3a7d89ea0fd7c...</w:t>
         </w:r>
       </w:hyperlink>
     </w:p>
@@ -189,6 +482,163 @@
     </w:sectPr>
   </w:body>
 </w:document>
+</file>
+
+<file path=word/numbering.xml><?xml version="1.0" encoding="utf-8"?>
+<w:numbering xmlns:wpc="http://schemas.microsoft.com/office/word/2010/wordprocessingCanvas" xmlns:cx="http://schemas.microsoft.com/office/drawing/2014/chartex" xmlns:cx1="http://schemas.microsoft.com/office/drawing/2015/9/8/chartex" xmlns:cx2="http://schemas.microsoft.com/office/drawing/2015/10/21/chartex" xmlns:cx3="http://schemas.microsoft.com/office/drawing/2016/5/9/chartex" xmlns:cx4="http://schemas.microsoft.com/office/drawing/2016/5/10/chartex" xmlns:cx5="http://schemas.microsoft.com/office/drawing/2016/5/11/chartex" xmlns:cx6="http://schemas.microsoft.com/office/drawing/2016/5/12/chartex" xmlns:cx7="http://schemas.microsoft.com/office/drawing/2016/5/13/chartex" xmlns:cx8="http://schemas.microsoft.com/office/drawing/2016/5/14/chartex" xmlns:mc="http://schemas.openxmlformats.org/markup-compatibility/2006" xmlns:aink="http://schemas.microsoft.com/office/drawing/2016/ink" xmlns:am3d="http://schemas.microsoft.com/office/drawing/2017/model3d" xmlns:o="urn:schemas-microsoft-com:office:office" xmlns:oel="http://schemas.microsoft.com/office/2019/extlst" xmlns:r="http://schemas.openxmlformats.org/officeDocument/2006/relationships" xmlns:m="http://schemas.openxmlformats.org/officeDocument/2006/math" xmlns:v="urn:schemas-microsoft-com:vml" xmlns:wp14="http://schemas.microsoft.com/office/word/2010/wordprocessingDrawing" xmlns:wp="http://schemas.openxmlformats.org/drawingml/2006/wordprocessingDrawing" xmlns:w10="urn:schemas-microsoft-com:office:word" xmlns:w="http://schemas.openxmlformats.org/wordprocessingml/2006/main" xmlns:w14="http://schemas.microsoft.com/office/word/2010/wordml" xmlns:w15="http://schemas.microsoft.com/office/word/2012/wordml" xmlns:w16cex="http://schemas.microsoft.com/office/word/2018/wordml/cex" xmlns:w16cid="http://schemas.microsoft.com/office/word/2016/wordml/cid" xmlns:w16="http://schemas.microsoft.com/office/word/2018/wordml" xmlns:w16du="http://schemas.microsoft.com/office/word/2023/wordml/word16du" xmlns:w16sdtdh="http://schemas.microsoft.com/office/word/2020/wordml/sdtdatahash" xmlns:w16sdtfl="http://schemas.microsoft.com/office/word/2024/wordml/sdtformatlock" xmlns:w16se="http://schemas.microsoft.com/office/word/2015/wordml/symex" xmlns:wpg="http://schemas.microsoft.com/office/word/2010/wordprocessingGroup" xmlns:wpi="http://schemas.microsoft.com/office/word/2010/wordprocessingInk" xmlns:wne="http://schemas.microsoft.com/office/word/2006/wordml" xmlns:wps="http://schemas.microsoft.com/office/word/2010/wordprocessingShape" mc:Ignorable="w14 w15 w16se w16cid w16 w16cex w16sdtdh w16sdtfl w16du wp14">
+  <w:abstractNum w:abstractNumId="0" w15:restartNumberingAfterBreak="0">
+    <w:nsid w:val="6FD63C3B"/>
+    <w:multiLevelType w:val="multilevel"/>
+    <w:tmpl w:val="C974DA12"/>
+    <w:lvl w:ilvl="0">
+      <w:start w:val="1"/>
+      <w:numFmt w:val="bullet"/>
+      <w:lvlText w:val=""/>
+      <w:lvlJc w:val="left"/>
+      <w:pPr>
+        <w:tabs>
+          <w:tab w:val="num" w:pos="720"/>
+        </w:tabs>
+        <w:ind w:left="720" w:hanging="360"/>
+      </w:pPr>
+      <w:rPr>
+        <w:rFonts w:ascii="Symbol" w:hAnsi="Symbol" w:hint="default"/>
+        <w:sz w:val="20"/>
+      </w:rPr>
+    </w:lvl>
+    <w:lvl w:ilvl="1" w:tentative="1">
+      <w:start w:val="1"/>
+      <w:numFmt w:val="bullet"/>
+      <w:lvlText w:val="o"/>
+      <w:lvlJc w:val="left"/>
+      <w:pPr>
+        <w:tabs>
+          <w:tab w:val="num" w:pos="1440"/>
+        </w:tabs>
+        <w:ind w:left="1440" w:hanging="360"/>
+      </w:pPr>
+      <w:rPr>
+        <w:rFonts w:ascii="Courier New" w:hAnsi="Courier New" w:hint="default"/>
+        <w:sz w:val="20"/>
+      </w:rPr>
+    </w:lvl>
+    <w:lvl w:ilvl="2" w:tentative="1">
+      <w:start w:val="1"/>
+      <w:numFmt w:val="bullet"/>
+      <w:lvlText w:val=""/>
+      <w:lvlJc w:val="left"/>
+      <w:pPr>
+        <w:tabs>
+          <w:tab w:val="num" w:pos="2160"/>
+        </w:tabs>
+        <w:ind w:left="2160" w:hanging="360"/>
+      </w:pPr>
+      <w:rPr>
+        <w:rFonts w:ascii="Wingdings" w:hAnsi="Wingdings" w:hint="default"/>
+        <w:sz w:val="20"/>
+      </w:rPr>
+    </w:lvl>
+    <w:lvl w:ilvl="3" w:tentative="1">
+      <w:start w:val="1"/>
+      <w:numFmt w:val="bullet"/>
+      <w:lvlText w:val=""/>
+      <w:lvlJc w:val="left"/>
+      <w:pPr>
+        <w:tabs>
+          <w:tab w:val="num" w:pos="2880"/>
+        </w:tabs>
+        <w:ind w:left="2880" w:hanging="360"/>
+      </w:pPr>
+      <w:rPr>
+        <w:rFonts w:ascii="Wingdings" w:hAnsi="Wingdings" w:hint="default"/>
+        <w:sz w:val="20"/>
+      </w:rPr>
+    </w:lvl>
+    <w:lvl w:ilvl="4" w:tentative="1">
+      <w:start w:val="1"/>
+      <w:numFmt w:val="bullet"/>
+      <w:lvlText w:val=""/>
+      <w:lvlJc w:val="left"/>
+      <w:pPr>
+        <w:tabs>
+          <w:tab w:val="num" w:pos="3600"/>
+        </w:tabs>
+        <w:ind w:left="3600" w:hanging="360"/>
+      </w:pPr>
+      <w:rPr>
+        <w:rFonts w:ascii="Wingdings" w:hAnsi="Wingdings" w:hint="default"/>
+        <w:sz w:val="20"/>
+      </w:rPr>
+    </w:lvl>
+    <w:lvl w:ilvl="5" w:tentative="1">
+      <w:start w:val="1"/>
+      <w:numFmt w:val="bullet"/>
+      <w:lvlText w:val=""/>
+      <w:lvlJc w:val="left"/>
+      <w:pPr>
+        <w:tabs>
+          <w:tab w:val="num" w:pos="4320"/>
+        </w:tabs>
+        <w:ind w:left="4320" w:hanging="360"/>
+      </w:pPr>
+      <w:rPr>
+        <w:rFonts w:ascii="Wingdings" w:hAnsi="Wingdings" w:hint="default"/>
+        <w:sz w:val="20"/>
+      </w:rPr>
+    </w:lvl>
+    <w:lvl w:ilvl="6" w:tentative="1">
+      <w:start w:val="1"/>
+      <w:numFmt w:val="bullet"/>
+      <w:lvlText w:val=""/>
+      <w:lvlJc w:val="left"/>
+      <w:pPr>
+        <w:tabs>
+          <w:tab w:val="num" w:pos="5040"/>
+        </w:tabs>
+        <w:ind w:left="5040" w:hanging="360"/>
+      </w:pPr>
+      <w:rPr>
+        <w:rFonts w:ascii="Wingdings" w:hAnsi="Wingdings" w:hint="default"/>
+        <w:sz w:val="20"/>
+      </w:rPr>
+    </w:lvl>
+    <w:lvl w:ilvl="7" w:tentative="1">
+      <w:start w:val="1"/>
+      <w:numFmt w:val="bullet"/>
+      <w:lvlText w:val=""/>
+      <w:lvlJc w:val="left"/>
+      <w:pPr>
+        <w:tabs>
+          <w:tab w:val="num" w:pos="5760"/>
+        </w:tabs>
+        <w:ind w:left="5760" w:hanging="360"/>
+      </w:pPr>
+      <w:rPr>
+        <w:rFonts w:ascii="Wingdings" w:hAnsi="Wingdings" w:hint="default"/>
+        <w:sz w:val="20"/>
+      </w:rPr>
+    </w:lvl>
+    <w:lvl w:ilvl="8" w:tentative="1">
+      <w:start w:val="1"/>
+      <w:numFmt w:val="bullet"/>
+      <w:lvlText w:val=""/>
+      <w:lvlJc w:val="left"/>
+      <w:pPr>
+        <w:tabs>
+          <w:tab w:val="num" w:pos="6480"/>
+        </w:tabs>
+        <w:ind w:left="6480" w:hanging="360"/>
+      </w:pPr>
+      <w:rPr>
+        <w:rFonts w:ascii="Wingdings" w:hAnsi="Wingdings" w:hint="default"/>
+        <w:sz w:val="20"/>
+      </w:rPr>
+    </w:lvl>
+  </w:abstractNum>
+  <w:num w:numId="1" w16cid:durableId="1349798720">
+    <w:abstractNumId w:val="0"/>
+  </w:num>
+</w:numbering>
 </file>
 
 <file path=word/styles.xml><?xml version="1.0" encoding="utf-8"?>
@@ -794,7 +1244,6 @@
   <w:style w:type="character" w:default="1" w:styleId="DefaultParagraphFont">
     <w:name w:val="Default Paragraph Font"/>
     <w:uiPriority w:val="1"/>
-    <w:semiHidden/>
     <w:unhideWhenUsed/>
   </w:style>
   <w:style w:type="table" w:default="1" w:styleId="TableNormal">
@@ -1129,6 +1578,18 @@
     <w:rPr>
       <w:color w:val="605E5C"/>
       <w:shd w:val="clear" w:color="auto" w:fill="E1DFDD"/>
+    </w:rPr>
+  </w:style>
+  <w:style w:type="character" w:styleId="FollowedHyperlink">
+    <w:name w:val="FollowedHyperlink"/>
+    <w:basedOn w:val="DefaultParagraphFont"/>
+    <w:uiPriority w:val="99"/>
+    <w:semiHidden/>
+    <w:unhideWhenUsed/>
+    <w:rsid w:val="000E71C4"/>
+    <w:rPr>
+      <w:color w:val="96607D" w:themeColor="followedHyperlink"/>
+      <w:u w:val="single"/>
     </w:rPr>
   </w:style>
 </w:styles>

</xml_diff>